<commit_message>
Add branch.cmd command + sync into WORKFLOW.md and Word doc
</commit_message>
<xml_diff>
--- a/HDFC-SKY-Terminal-Workflow.docx
+++ b/HDFC-SKY-Terminal-Workflow.docx
@@ -139,7 +139,7 @@
             </w:tcMar>
           </w:tcPr>
           <w:p>
-            <w:hyperlink w:history="1" r:id="rIdnubinvv3pzpn_69ebvnvg">
+            <w:hyperlink w:history="1" r:id="rId7p5aaunbamiffdxwtio01">
               <w:r>
                 <w:rPr>
                   <w:rStyle w:val="Hyperlink"/>
@@ -187,7 +187,7 @@
             </w:tcMar>
           </w:tcPr>
           <w:p>
-            <w:hyperlink w:history="1" r:id="rId7v0m-1mzhte8mqzzf55qk">
+            <w:hyperlink w:history="1" r:id="rId9fbi4rdbdgxtzump5-dgz">
               <w:r>
                 <w:rPr>
                   <w:rStyle w:val="Hyperlink"/>
@@ -404,7 +404,7 @@
             </w:tcMar>
           </w:tcPr>
           <w:p>
-            <w:hyperlink w:history="1" r:id="rIdfsw4vvmcurkghtpoey72b">
+            <w:hyperlink w:history="1" r:id="rIdoqqkkjresja3rcuabafnu">
               <w:r>
                 <w:rPr>
                   <w:rStyle w:val="Hyperlink"/>
@@ -454,7 +454,7 @@
             </w:tcMar>
           </w:tcPr>
           <w:p>
-            <w:hyperlink w:history="1" r:id="rIdftip9pgy9zpk8bzbklukm">
+            <w:hyperlink w:history="1" r:id="rIdef8hpfeqarhmv5xqifv5b">
               <w:r>
                 <w:rPr>
                   <w:rStyle w:val="Hyperlink"/>
@@ -812,6 +812,63 @@
           <w:szCs w:val="22"/>
         </w:rPr>
         <w:t xml:space="preserve"> directly. Make your own branch so your work cannot collide with others.</w:t>
+      </w:r>
+    </w:p>
+    <w:p>
+      <w:pPr>
+        <w:spacing w:after="120" w:line="276"/>
+      </w:pPr>
+      <w:r>
+        <w:rPr>
+          <w:rFonts w:ascii="Calibri" w:cs="Calibri" w:eastAsia="Calibri" w:hAnsi="Calibri"/>
+          <w:b/>
+          <w:bCs/>
+          <w:color w:val="1A1A2E"/>
+          <w:sz w:val="22"/>
+          <w:szCs w:val="22"/>
+        </w:rPr>
+        <w:t xml:space="preserve">Easy way (owner): </w:t>
+      </w:r>
+      <w:r>
+        <w:rPr>
+          <w:rFonts w:ascii="Calibri" w:cs="Calibri" w:eastAsia="Calibri" w:hAnsi="Calibri"/>
+          <w:color w:val="1A1A2E"/>
+          <w:sz w:val="22"/>
+          <w:szCs w:val="22"/>
+        </w:rPr>
+        <w:t xml:space="preserve">run the branch command — it asks for a name and creates the branch for you:</w:t>
+      </w:r>
+    </w:p>
+    <w:p>
+      <w:pPr>
+        <w:shd w:fill="F4F5FB" w:val="clear"/>
+        <w:spacing w:after="160" w:before="40" w:line="264"/>
+        <w:ind w:left="120" w:right="120"/>
+      </w:pPr>
+      <w:r>
+        <w:rPr>
+          <w:rFonts w:ascii="Consolas" w:cs="Consolas" w:eastAsia="Consolas" w:hAnsi="Consolas"/>
+          <w:color w:val="1B1E48"/>
+          <w:sz w:val="19"/>
+          <w:szCs w:val="19"/>
+        </w:rPr>
+        <w:t xml:space="preserve">.\branch</w:t>
+      </w:r>
+    </w:p>
+    <w:p>
+      <w:pPr>
+        <w:spacing w:after="60" w:before="80"/>
+      </w:pPr>
+      <w:r>
+        <w:rPr>
+          <w:rFonts w:ascii="Calibri" w:cs="Calibri" w:eastAsia="Calibri" w:hAnsi="Calibri"/>
+          <w:b/>
+          <w:bCs/>
+          <w:color w:val="1A1A2E"/>
+          <w:sz w:val="22"/>
+          <w:szCs w:val="22"/>
+        </w:rPr>
+        <w:t xml:space="preserve">Manual way (and for colleagues):</w:t>
       </w:r>
     </w:p>
     <w:p>

</xml_diff>

<commit_message>
docs: add dev-server start + port-conflict guidance to WORKFLOW.md and Word doc
</commit_message>
<xml_diff>
--- a/HDFC-SKY-Terminal-Workflow.docx
+++ b/HDFC-SKY-Terminal-Workflow.docx
@@ -139,7 +139,7 @@
             </w:tcMar>
           </w:tcPr>
           <w:p>
-            <w:hyperlink w:history="1" r:id="rId7p5aaunbamiffdxwtio01">
+            <w:hyperlink w:history="1" r:id="rIdn_noz-6enkqa70u_skstq">
               <w:r>
                 <w:rPr>
                   <w:rStyle w:val="Hyperlink"/>
@@ -187,7 +187,7 @@
             </w:tcMar>
           </w:tcPr>
           <w:p>
-            <w:hyperlink w:history="1" r:id="rId9fbi4rdbdgxtzump5-dgz">
+            <w:hyperlink w:history="1" r:id="rIdnxopvelmbg3ov_l76bown">
               <w:r>
                 <w:rPr>
                   <w:rStyle w:val="Hyperlink"/>
@@ -404,7 +404,7 @@
             </w:tcMar>
           </w:tcPr>
           <w:p>
-            <w:hyperlink w:history="1" r:id="rIdoqqkkjresja3rcuabafnu">
+            <w:hyperlink w:history="1" r:id="rIdcvnt3qsk8ty6szohiaaev">
               <w:r>
                 <w:rPr>
                   <w:rStyle w:val="Hyperlink"/>
@@ -454,7 +454,7 @@
             </w:tcMar>
           </w:tcPr>
           <w:p>
-            <w:hyperlink w:history="1" r:id="rIdef8hpfeqarhmv5xqifv5b">
+            <w:hyperlink w:history="1" r:id="rIdudruxzv03bclw02fiebud">
               <w:r>
                 <w:rPr>
                   <w:rStyle w:val="Hyperlink"/>
@@ -767,233 +767,6 @@
     </w:p>
     <w:p>
       <w:pPr>
-        <w:pStyle w:val="Heading1"/>
-        <w:spacing w:after="140" w:before="320"/>
-      </w:pPr>
-      <w:r>
-        <w:rPr>
-          <w:rFonts w:ascii="Calibri" w:cs="Calibri" w:eastAsia="Calibri" w:hAnsi="Calibri"/>
-          <w:b/>
-          <w:bCs/>
-          <w:color w:val="2850E7"/>
-          <w:sz w:val="30"/>
-          <w:szCs w:val="30"/>
-        </w:rPr>
-        <w:t xml:space="preserve">2.  Start a piece of work (your own branch)</w:t>
-      </w:r>
-    </w:p>
-    <w:p>
-      <w:pPr>
-        <w:spacing w:after="120" w:line="276"/>
-      </w:pPr>
-      <w:r>
-        <w:rPr>
-          <w:rFonts w:ascii="Calibri" w:cs="Calibri" w:eastAsia="Calibri" w:hAnsi="Calibri"/>
-          <w:color w:val="1A1A2E"/>
-          <w:sz w:val="22"/>
-          <w:szCs w:val="22"/>
-        </w:rPr>
-        <w:t xml:space="preserve">Never edit </w:t>
-      </w:r>
-      <w:r>
-        <w:rPr>
-          <w:rFonts w:ascii="Consolas" w:cs="Consolas" w:eastAsia="Consolas" w:hAnsi="Consolas"/>
-          <w:color w:val="1B1E48"/>
-          <w:sz w:val="20"/>
-          <w:szCs w:val="20"/>
-        </w:rPr>
-        <w:t xml:space="preserve">main</w:t>
-      </w:r>
-      <w:r>
-        <w:rPr>
-          <w:rFonts w:ascii="Calibri" w:cs="Calibri" w:eastAsia="Calibri" w:hAnsi="Calibri"/>
-          <w:color w:val="1A1A2E"/>
-          <w:sz w:val="22"/>
-          <w:szCs w:val="22"/>
-        </w:rPr>
-        <w:t xml:space="preserve"> directly. Make your own branch so your work cannot collide with others.</w:t>
-      </w:r>
-    </w:p>
-    <w:p>
-      <w:pPr>
-        <w:spacing w:after="120" w:line="276"/>
-      </w:pPr>
-      <w:r>
-        <w:rPr>
-          <w:rFonts w:ascii="Calibri" w:cs="Calibri" w:eastAsia="Calibri" w:hAnsi="Calibri"/>
-          <w:b/>
-          <w:bCs/>
-          <w:color w:val="1A1A2E"/>
-          <w:sz w:val="22"/>
-          <w:szCs w:val="22"/>
-        </w:rPr>
-        <w:t xml:space="preserve">Easy way (owner): </w:t>
-      </w:r>
-      <w:r>
-        <w:rPr>
-          <w:rFonts w:ascii="Calibri" w:cs="Calibri" w:eastAsia="Calibri" w:hAnsi="Calibri"/>
-          <w:color w:val="1A1A2E"/>
-          <w:sz w:val="22"/>
-          <w:szCs w:val="22"/>
-        </w:rPr>
-        <w:t xml:space="preserve">run the branch command — it asks for a name and creates the branch for you:</w:t>
-      </w:r>
-    </w:p>
-    <w:p>
-      <w:pPr>
-        <w:shd w:fill="F4F5FB" w:val="clear"/>
-        <w:spacing w:after="160" w:before="40" w:line="264"/>
-        <w:ind w:left="120" w:right="120"/>
-      </w:pPr>
-      <w:r>
-        <w:rPr>
-          <w:rFonts w:ascii="Consolas" w:cs="Consolas" w:eastAsia="Consolas" w:hAnsi="Consolas"/>
-          <w:color w:val="1B1E48"/>
-          <w:sz w:val="19"/>
-          <w:szCs w:val="19"/>
-        </w:rPr>
-        <w:t xml:space="preserve">.\branch</w:t>
-      </w:r>
-    </w:p>
-    <w:p>
-      <w:pPr>
-        <w:spacing w:after="60" w:before="80"/>
-      </w:pPr>
-      <w:r>
-        <w:rPr>
-          <w:rFonts w:ascii="Calibri" w:cs="Calibri" w:eastAsia="Calibri" w:hAnsi="Calibri"/>
-          <w:b/>
-          <w:bCs/>
-          <w:color w:val="1A1A2E"/>
-          <w:sz w:val="22"/>
-          <w:szCs w:val="22"/>
-        </w:rPr>
-        <w:t xml:space="preserve">Manual way (and for colleagues):</w:t>
-      </w:r>
-    </w:p>
-    <w:p>
-      <w:pPr>
-        <w:shd w:fill="F4F5FB" w:val="clear"/>
-        <w:spacing w:after="0" w:before="40" w:line="264"/>
-        <w:ind w:left="120" w:right="120"/>
-      </w:pPr>
-      <w:r>
-        <w:rPr>
-          <w:rFonts w:ascii="Consolas" w:cs="Consolas" w:eastAsia="Consolas" w:hAnsi="Consolas"/>
-          <w:color w:val="1B1E48"/>
-          <w:sz w:val="19"/>
-          <w:szCs w:val="19"/>
-        </w:rPr>
-        <w:t xml:space="preserve">git checkout main</w:t>
-      </w:r>
-    </w:p>
-    <w:p>
-      <w:pPr>
-        <w:shd w:fill="F4F5FB" w:val="clear"/>
-        <w:spacing w:after="0" w:before="0" w:line="264"/>
-        <w:ind w:left="120" w:right="120"/>
-      </w:pPr>
-      <w:r>
-        <w:rPr>
-          <w:rFonts w:ascii="Consolas" w:cs="Consolas" w:eastAsia="Consolas" w:hAnsi="Consolas"/>
-          <w:color w:val="1B1E48"/>
-          <w:sz w:val="19"/>
-          <w:szCs w:val="19"/>
-        </w:rPr>
-        <w:t xml:space="preserve">git pull                          # get everyone's latest</w:t>
-      </w:r>
-    </w:p>
-    <w:p>
-      <w:pPr>
-        <w:shd w:fill="F4F5FB" w:val="clear"/>
-        <w:spacing w:after="160" w:before="0" w:line="264"/>
-        <w:ind w:left="120" w:right="120"/>
-      </w:pPr>
-      <w:r>
-        <w:rPr>
-          <w:rFonts w:ascii="Consolas" w:cs="Consolas" w:eastAsia="Consolas" w:hAnsi="Consolas"/>
-          <w:color w:val="1B1E48"/>
-          <w:sz w:val="19"/>
-          <w:szCs w:val="19"/>
-        </w:rPr>
-        <w:t xml:space="preserve">git checkout -b feat/my-widget    # -b = create + switch to a new branch</w:t>
-      </w:r>
-    </w:p>
-    <w:p>
-      <w:pPr>
-        <w:pStyle w:val="Heading1"/>
-        <w:spacing w:after="140" w:before="320"/>
-      </w:pPr>
-      <w:r>
-        <w:rPr>
-          <w:rFonts w:ascii="Calibri" w:cs="Calibri" w:eastAsia="Calibri" w:hAnsi="Calibri"/>
-          <w:b/>
-          <w:bCs/>
-          <w:color w:val="2850E7"/>
-          <w:sz w:val="30"/>
-          <w:szCs w:val="30"/>
-        </w:rPr>
-        <w:t xml:space="preserve">3.  Build / edit on localhost</w:t>
-      </w:r>
-    </w:p>
-    <w:p>
-      <w:pPr>
-        <w:spacing w:after="120" w:line="276"/>
-      </w:pPr>
-      <w:r>
-        <w:rPr>
-          <w:rFonts w:ascii="Calibri" w:cs="Calibri" w:eastAsia="Calibri" w:hAnsi="Calibri"/>
-          <w:color w:val="1A1A2E"/>
-          <w:sz w:val="22"/>
-          <w:szCs w:val="22"/>
-        </w:rPr>
-        <w:t xml:space="preserve">Make your change — by hand in the editor, or by asking Cursor / Claude (for example: “Build the straddle chart widget from Figma node 46:5014”). The house rules load automatically, so the brand styling is handled for you.</w:t>
-      </w:r>
-    </w:p>
-    <w:p>
-      <w:pPr>
-        <w:spacing w:after="120" w:line="276"/>
-      </w:pPr>
-      <w:r>
-        <w:rPr>
-          <w:rFonts w:ascii="Calibri" w:cs="Calibri" w:eastAsia="Calibri" w:hAnsi="Calibri"/>
-          <w:b/>
-          <w:bCs/>
-          <w:color w:val="1A1A2E"/>
-          <w:sz w:val="22"/>
-          <w:szCs w:val="22"/>
-        </w:rPr>
-        <w:t xml:space="preserve">As you save, http://localhost:3000 refreshes instantly</w:t>
-      </w:r>
-      <w:r>
-        <w:rPr>
-          <w:rFonts w:ascii="Calibri" w:cs="Calibri" w:eastAsia="Calibri" w:hAnsi="Calibri"/>
-          <w:color w:val="1A1A2E"/>
-          <w:sz w:val="22"/>
-          <w:szCs w:val="22"/>
-        </w:rPr>
-        <w:t xml:space="preserve"> and shows your change. This is private to your laptop until you push. Iterate until you are happy.</w:t>
-      </w:r>
-    </w:p>
-    <w:p>
-      <w:pPr>
-        <w:pStyle w:val="Heading1"/>
-        <w:spacing w:after="140" w:before="320"/>
-      </w:pPr>
-      <w:r>
-        <w:rPr>
-          <w:rFonts w:ascii="Calibri" w:cs="Calibri" w:eastAsia="Calibri" w:hAnsi="Calibri"/>
-          <w:b/>
-          <w:bCs/>
-          <w:color w:val="2850E7"/>
-          <w:sz w:val="30"/>
-          <w:szCs w:val="30"/>
-        </w:rPr>
-        <w:t xml:space="preserve">4.  Save &amp; go live</w:t>
-      </w:r>
-    </w:p>
-    <w:p>
-      <w:pPr>
         <w:pStyle w:val="Heading2"/>
         <w:spacing w:after="100" w:before="220"/>
       </w:pPr>
@@ -1006,7 +779,7 @@
           <w:sz w:val="25"/>
           <w:szCs w:val="25"/>
         </w:rPr>
-        <w:t xml:space="preserve">The easy way (owner): the “ship” command</w:t>
+        <w:t xml:space="preserve">Starting the server again later</w:t>
       </w:r>
     </w:p>
     <w:p>
@@ -1020,7 +793,7 @@
           <w:sz w:val="22"/>
           <w:szCs w:val="22"/>
         </w:rPr>
-        <w:t xml:space="preserve">When you are happy with localhost, open PowerShell in the project folder and run:</w:t>
+        <w:t xml:space="preserve">In PowerShell, from the project’s terminal/ folder:</w:t>
       </w:r>
     </w:p>
     <w:p>
@@ -1036,7 +809,7 @@
           <w:sz w:val="19"/>
           <w:szCs w:val="19"/>
         </w:rPr>
-        <w:t xml:space="preserve">cd C:\Users\Admin\Downloads\Terminal-Project</w:t>
+        <w:t xml:space="preserve">cd C:\Users\Admin\Downloads\Terminal-Project\terminal</w:t>
       </w:r>
     </w:p>
     <w:p>
@@ -1052,21 +825,7 @@
           <w:sz w:val="19"/>
           <w:szCs w:val="19"/>
         </w:rPr>
-        <w:t xml:space="preserve">.\ship</w:t>
-      </w:r>
-    </w:p>
-    <w:p>
-      <w:pPr>
-        <w:spacing w:after="120" w:line="276"/>
-      </w:pPr>
-      <w:r>
-        <w:rPr>
-          <w:rFonts w:ascii="Calibri" w:cs="Calibri" w:eastAsia="Calibri" w:hAnsi="Calibri"/>
-          <w:color w:val="1A1A2E"/>
-          <w:sz w:val="22"/>
-          <w:szCs w:val="22"/>
-        </w:rPr>
-        <w:t xml:space="preserve">It asks “What did you change?”, then does everything — stages your changes, commits, merges into main, and pushes. Your change is live in about a minute. One word replaces all the git commands below.</w:t>
+        <w:t xml:space="preserve">npm run dev</w:t>
       </w:r>
     </w:p>
     <w:p>
@@ -1083,7 +842,7 @@
           <w:sz w:val="25"/>
           <w:szCs w:val="25"/>
         </w:rPr>
-        <w:t xml:space="preserve">The manual way (and what every colleague should do)</w:t>
+        <w:t xml:space="preserve">“Port 3000 is in use” / “Another next dev server is already running”</w:t>
       </w:r>
     </w:p>
     <w:p>
@@ -1097,121 +856,7 @@
           <w:sz w:val="22"/>
           <w:szCs w:val="22"/>
         </w:rPr>
-        <w:t xml:space="preserve">When the change looks right:</w:t>
-      </w:r>
-    </w:p>
-    <w:p>
-      <w:pPr>
-        <w:shd w:fill="F4F5FB" w:val="clear"/>
-        <w:spacing w:after="0" w:before="40" w:line="264"/>
-        <w:ind w:left="120" w:right="120"/>
-      </w:pPr>
-      <w:r>
-        <w:rPr>
-          <w:rFonts w:ascii="Consolas" w:cs="Consolas" w:eastAsia="Consolas" w:hAnsi="Consolas"/>
-          <w:color w:val="1B1E48"/>
-          <w:sz w:val="19"/>
-          <w:szCs w:val="19"/>
-        </w:rPr>
-        <w:t xml:space="preserve">git add -A                        # -A = gather ALL your changed files</w:t>
-      </w:r>
-    </w:p>
-    <w:p>
-      <w:pPr>
-        <w:shd w:fill="F4F5FB" w:val="clear"/>
-        <w:spacing w:after="0" w:before="0" w:line="264"/>
-        <w:ind w:left="120" w:right="120"/>
-      </w:pPr>
-      <w:r>
-        <w:rPr>
-          <w:rFonts w:ascii="Consolas" w:cs="Consolas" w:eastAsia="Consolas" w:hAnsi="Consolas"/>
-          <w:color w:val="1B1E48"/>
-          <w:sz w:val="19"/>
-          <w:szCs w:val="19"/>
-        </w:rPr>
-        <w:t xml:space="preserve">git commit -m "Describe what you did"</w:t>
-      </w:r>
-    </w:p>
-    <w:p>
-      <w:pPr>
-        <w:shd w:fill="F4F5FB" w:val="clear"/>
-        <w:spacing w:after="160" w:before="0" w:line="264"/>
-        <w:ind w:left="120" w:right="120"/>
-      </w:pPr>
-      <w:r>
-        <w:rPr>
-          <w:rFonts w:ascii="Consolas" w:cs="Consolas" w:eastAsia="Consolas" w:hAnsi="Consolas"/>
-          <w:color w:val="1B1E48"/>
-          <w:sz w:val="19"/>
-          <w:szCs w:val="19"/>
-        </w:rPr>
-        <w:t xml:space="preserve">git push -u origin feat/my-widget # upload your branch to GitHub</w:t>
-      </w:r>
-    </w:p>
-    <w:p>
-      <w:pPr>
-        <w:spacing w:after="120" w:line="276"/>
-      </w:pPr>
-      <w:r>
-        <w:rPr>
-          <w:rFonts w:ascii="Calibri" w:cs="Calibri" w:eastAsia="Calibri" w:hAnsi="Calibri"/>
-          <w:b/>
-          <w:bCs/>
-          <w:color w:val="C0392B"/>
-          <w:sz w:val="22"/>
-          <w:szCs w:val="22"/>
-        </w:rPr>
-        <w:t xml:space="preserve">IMPORTANT — pushing your branch does NOT update the live site.</w:t>
-      </w:r>
-      <w:r>
-        <w:rPr>
-          <w:rFonts w:ascii="Calibri" w:cs="Calibri" w:eastAsia="Calibri" w:hAnsi="Calibri"/>
-          <w:color w:val="1A1A2E"/>
-          <w:sz w:val="22"/>
-          <w:szCs w:val="22"/>
-        </w:rPr>
-        <w:t xml:space="preserve"> A branch push only creates a private preview. Your change goes live ONLY after it is merged into main (below). If the site did not change, this is why.</w:t>
-      </w:r>
-    </w:p>
-    <w:p>
-      <w:pPr>
-        <w:spacing w:after="60" w:before="100"/>
-      </w:pPr>
-      <w:r>
-        <w:rPr>
-          <w:rFonts w:ascii="Calibri" w:cs="Calibri" w:eastAsia="Calibri" w:hAnsi="Calibri"/>
-          <w:b/>
-          <w:bCs/>
-          <w:color w:val="1A1A2E"/>
-          <w:sz w:val="22"/>
-          <w:szCs w:val="22"/>
-        </w:rPr>
-        <w:t xml:space="preserve">To make it live, merge into main — two ways:</w:t>
-      </w:r>
-    </w:p>
-    <w:p>
-      <w:pPr>
-        <w:spacing w:after="120" w:line="276"/>
-      </w:pPr>
-      <w:r>
-        <w:rPr>
-          <w:rFonts w:ascii="Calibri" w:cs="Calibri" w:eastAsia="Calibri" w:hAnsi="Calibri"/>
-          <w:b/>
-          <w:bCs/>
-          <w:color w:val="1A1A2E"/>
-          <w:sz w:val="22"/>
-          <w:szCs w:val="22"/>
-        </w:rPr>
-        <w:t xml:space="preserve">Option A — Pull Request (recommended for the team).</w:t>
-      </w:r>
-      <w:r>
-        <w:rPr>
-          <w:rFonts w:ascii="Calibri" w:cs="Calibri" w:eastAsia="Calibri" w:hAnsi="Calibri"/>
-          <w:color w:val="1A1A2E"/>
-          <w:sz w:val="22"/>
-          <w:szCs w:val="22"/>
-        </w:rPr>
-        <w:t xml:space="preserve"> In the browser on the repository page:</w:t>
+        <w:t xml:space="preserve">This means a dev server is already running (often a leftover one). Either:</w:t>
       </w:r>
     </w:p>
     <w:p>
@@ -1230,47 +875,7 @@
           <w:sz w:val="22"/>
           <w:szCs w:val="22"/>
         </w:rPr>
-        <w:t xml:space="preserve">Click </w:t>
-      </w:r>
-      <w:r>
-        <w:rPr>
-          <w:rFonts w:ascii="Calibri" w:cs="Calibri" w:eastAsia="Calibri" w:hAnsi="Calibri"/>
-          <w:b/>
-          <w:bCs/>
-          <w:color w:val="1A1A2E"/>
-          <w:sz w:val="22"/>
-          <w:szCs w:val="22"/>
-        </w:rPr>
-        <w:t xml:space="preserve">Compare &amp; pull request</w:t>
-      </w:r>
-      <w:r>
-        <w:rPr>
-          <w:rFonts w:ascii="Calibri" w:cs="Calibri" w:eastAsia="Calibri" w:hAnsi="Calibri"/>
-          <w:color w:val="1A1A2E"/>
-          <w:sz w:val="22"/>
-          <w:szCs w:val="22"/>
-        </w:rPr>
-        <w:t xml:space="preserve">, then </w:t>
-      </w:r>
-      <w:r>
-        <w:rPr>
-          <w:rFonts w:ascii="Calibri" w:cs="Calibri" w:eastAsia="Calibri" w:hAnsi="Calibri"/>
-          <w:b/>
-          <w:bCs/>
-          <w:color w:val="1A1A2E"/>
-          <w:sz w:val="22"/>
-          <w:szCs w:val="22"/>
-        </w:rPr>
-        <w:t xml:space="preserve">Create pull request</w:t>
-      </w:r>
-      <w:r>
-        <w:rPr>
-          <w:rFonts w:ascii="Calibri" w:cs="Calibri" w:eastAsia="Calibri" w:hAnsi="Calibri"/>
-          <w:color w:val="1A1A2E"/>
-          <w:sz w:val="22"/>
-          <w:szCs w:val="22"/>
-        </w:rPr>
-        <w:t xml:space="preserve">.</w:t>
+        <w:t xml:space="preserve">Use the port it picked instead (e.g. it will say http://localhost:3001), or</w:t>
       </w:r>
     </w:p>
     <w:p>
@@ -1289,124 +894,29 @@
           <w:sz w:val="22"/>
           <w:szCs w:val="22"/>
         </w:rPr>
-        <w:t xml:space="preserve">Review, then click </w:t>
-      </w:r>
-      <w:r>
-        <w:rPr>
-          <w:rFonts w:ascii="Calibri" w:cs="Calibri" w:eastAsia="Calibri" w:hAnsi="Calibri"/>
-          <w:b/>
-          <w:bCs/>
-          <w:color w:val="1A1A2E"/>
-          <w:sz w:val="22"/>
-          <w:szCs w:val="22"/>
-        </w:rPr>
-        <w:t xml:space="preserve">Merge pull request</w:t>
-      </w:r>
-      <w:r>
-        <w:rPr>
-          <w:rFonts w:ascii="Calibri" w:cs="Calibri" w:eastAsia="Calibri" w:hAnsi="Calibri"/>
-          <w:color w:val="1A1A2E"/>
-          <w:sz w:val="22"/>
-          <w:szCs w:val="22"/>
-        </w:rPr>
-        <w:t xml:space="preserve"> — this auto-deploys to live.</w:t>
-      </w:r>
-    </w:p>
-    <w:p>
-      <w:pPr>
-        <w:spacing w:after="60" w:before="100"/>
-      </w:pPr>
-      <w:r>
-        <w:rPr>
-          <w:rFonts w:ascii="Calibri" w:cs="Calibri" w:eastAsia="Calibri" w:hAnsi="Calibri"/>
-          <w:b/>
-          <w:bCs/>
-          <w:color w:val="1A1A2E"/>
-          <w:sz w:val="22"/>
-          <w:szCs w:val="22"/>
-        </w:rPr>
-        <w:t xml:space="preserve">Option B — Quick merge from the terminal (fine for the owner working solo):</w:t>
-      </w:r>
-    </w:p>
-    <w:p>
-      <w:pPr>
-        <w:shd w:fill="F4F5FB" w:val="clear"/>
-        <w:spacing w:after="0" w:before="40" w:line="264"/>
-        <w:ind w:left="120" w:right="120"/>
-      </w:pPr>
-      <w:r>
-        <w:rPr>
-          <w:rFonts w:ascii="Consolas" w:cs="Consolas" w:eastAsia="Consolas" w:hAnsi="Consolas"/>
-          <w:color w:val="1B1E48"/>
-          <w:sz w:val="19"/>
-          <w:szCs w:val="19"/>
-        </w:rPr>
-        <w:t xml:space="preserve">git checkout main</w:t>
-      </w:r>
-    </w:p>
-    <w:p>
-      <w:pPr>
-        <w:shd w:fill="F4F5FB" w:val="clear"/>
-        <w:spacing w:after="0" w:before="0" w:line="264"/>
-        <w:ind w:left="120" w:right="120"/>
-      </w:pPr>
-      <w:r>
-        <w:rPr>
-          <w:rFonts w:ascii="Consolas" w:cs="Consolas" w:eastAsia="Consolas" w:hAnsi="Consolas"/>
-          <w:color w:val="1B1E48"/>
-          <w:sz w:val="19"/>
-          <w:szCs w:val="19"/>
-        </w:rPr>
-        <w:t xml:space="preserve">git pull</w:t>
-      </w:r>
-    </w:p>
-    <w:p>
-      <w:pPr>
-        <w:shd w:fill="F4F5FB" w:val="clear"/>
-        <w:spacing w:after="0" w:before="0" w:line="264"/>
-        <w:ind w:left="120" w:right="120"/>
-      </w:pPr>
-      <w:r>
-        <w:rPr>
-          <w:rFonts w:ascii="Consolas" w:cs="Consolas" w:eastAsia="Consolas" w:hAnsi="Consolas"/>
-          <w:color w:val="1B1E48"/>
-          <w:sz w:val="19"/>
-          <w:szCs w:val="19"/>
-        </w:rPr>
-        <w:t xml:space="preserve">git merge feat/my-widget       # bring your branch into main</w:t>
-      </w:r>
-    </w:p>
-    <w:p>
-      <w:pPr>
-        <w:shd w:fill="F4F5FB" w:val="clear"/>
-        <w:spacing w:after="160" w:before="0" w:line="264"/>
-        <w:ind w:left="120" w:right="120"/>
-      </w:pPr>
-      <w:r>
-        <w:rPr>
-          <w:rFonts w:ascii="Consolas" w:cs="Consolas" w:eastAsia="Consolas" w:hAnsi="Consolas"/>
-          <w:color w:val="1B1E48"/>
-          <w:sz w:val="19"/>
-          <w:szCs w:val="19"/>
-        </w:rPr>
-        <w:t xml:space="preserve">git push origin main           # -&gt; auto-deploys to the live site</w:t>
+        <w:t xml:space="preserve">Free up port 3000 by stopping the old server. PowerShell prints the PID — stop it with the command below, then run npm run dev again.</w:t>
+      </w:r>
+    </w:p>
+    <w:p>
+      <w:pPr>
+        <w:shd w:fill="F4F5FB" w:val="clear"/>
+        <w:spacing w:after="160" w:before="40" w:line="264"/>
+        <w:ind w:left="120" w:right="120"/>
+      </w:pPr>
+      <w:r>
+        <w:rPr>
+          <w:rFonts w:ascii="Consolas" w:cs="Consolas" w:eastAsia="Consolas" w:hAnsi="Consolas"/>
+          <w:color w:val="1B1E48"/>
+          <w:sz w:val="19"/>
+          <w:szCs w:val="19"/>
+        </w:rPr>
+        <w:t xml:space="preserve">taskkill /PID &lt;the-PID-it-printed&gt; /F</w:t>
       </w:r>
     </w:p>
     <w:p>
       <w:pPr>
         <w:spacing w:after="120" w:line="276"/>
       </w:pPr>
-      <w:r>
-        <w:rPr>
-          <w:rFonts w:ascii="Calibri" w:cs="Calibri" w:eastAsia="Calibri" w:hAnsi="Calibri"/>
-          <w:b/>
-          <w:bCs/>
-          <w:color w:val="1A1A2E"/>
-          <w:sz w:val="22"/>
-          <w:szCs w:val="22"/>
-        </w:rPr>
-        <w:t xml:space="preserve">Tip: </w:t>
-      </w:r>
       <w:r>
         <w:rPr>
           <w:rFonts w:ascii="Calibri" w:cs="Calibri" w:eastAsia="Calibri" w:hAnsi="Calibri"/>
@@ -1416,7 +926,7 @@
           <w:sz w:val="22"/>
           <w:szCs w:val="22"/>
         </w:rPr>
-        <w:t xml:space="preserve">after it is live, wait about a minute then hard-refresh with Ctrl + Shift + R to clear the browser cache.</w:t>
+        <w:t xml:space="preserve">You only ever need one dev server running.</w:t>
       </w:r>
     </w:p>
     <w:p>
@@ -1433,7 +943,7 @@
           <w:sz w:val="30"/>
           <w:szCs w:val="30"/>
         </w:rPr>
-        <w:t xml:space="preserve">5.  Take a widget's design INTO Figma (code → Figma)</w:t>
+        <w:t xml:space="preserve">2.  Start a piece of work (your own branch)</w:t>
       </w:r>
     </w:p>
     <w:p>
@@ -1447,27 +957,203 @@
           <w:sz w:val="22"/>
           <w:szCs w:val="22"/>
         </w:rPr>
-        <w:t xml:space="preserve">When you want a widget or element to exist in Figma — and only that element — use a </w:t>
-      </w:r>
-      <w:r>
-        <w:rPr>
-          <w:rFonts w:ascii="Calibri" w:cs="Calibri" w:eastAsia="Calibri" w:hAnsi="Calibri"/>
-          <w:b/>
-          <w:bCs/>
-          <w:color w:val="1A1A2E"/>
-          <w:sz w:val="22"/>
-          <w:szCs w:val="22"/>
-        </w:rPr>
-        <w:t xml:space="preserve">preview route</w:t>
-      </w:r>
-      <w:r>
-        <w:rPr>
-          <w:rFonts w:ascii="Calibri" w:cs="Calibri" w:eastAsia="Calibri" w:hAnsi="Calibri"/>
-          <w:color w:val="1A1A2E"/>
-          <w:sz w:val="22"/>
-          <w:szCs w:val="22"/>
-        </w:rPr>
-        <w:t xml:space="preserve">. It is a tiny page that shows one element alone, giving it its own public URL.</w:t>
+        <w:t xml:space="preserve">Never edit </w:t>
+      </w:r>
+      <w:r>
+        <w:rPr>
+          <w:rFonts w:ascii="Consolas" w:cs="Consolas" w:eastAsia="Consolas" w:hAnsi="Consolas"/>
+          <w:color w:val="1B1E48"/>
+          <w:sz w:val="20"/>
+          <w:szCs w:val="20"/>
+        </w:rPr>
+        <w:t xml:space="preserve">main</w:t>
+      </w:r>
+      <w:r>
+        <w:rPr>
+          <w:rFonts w:ascii="Calibri" w:cs="Calibri" w:eastAsia="Calibri" w:hAnsi="Calibri"/>
+          <w:color w:val="1A1A2E"/>
+          <w:sz w:val="22"/>
+          <w:szCs w:val="22"/>
+        </w:rPr>
+        <w:t xml:space="preserve"> directly. Make your own branch so your work cannot collide with others.</w:t>
+      </w:r>
+    </w:p>
+    <w:p>
+      <w:pPr>
+        <w:spacing w:after="120" w:line="276"/>
+      </w:pPr>
+      <w:r>
+        <w:rPr>
+          <w:rFonts w:ascii="Calibri" w:cs="Calibri" w:eastAsia="Calibri" w:hAnsi="Calibri"/>
+          <w:b/>
+          <w:bCs/>
+          <w:color w:val="1A1A2E"/>
+          <w:sz w:val="22"/>
+          <w:szCs w:val="22"/>
+        </w:rPr>
+        <w:t xml:space="preserve">Easy way (owner): </w:t>
+      </w:r>
+      <w:r>
+        <w:rPr>
+          <w:rFonts w:ascii="Calibri" w:cs="Calibri" w:eastAsia="Calibri" w:hAnsi="Calibri"/>
+          <w:color w:val="1A1A2E"/>
+          <w:sz w:val="22"/>
+          <w:szCs w:val="22"/>
+        </w:rPr>
+        <w:t xml:space="preserve">run the branch command — it asks for a name and creates the branch for you:</w:t>
+      </w:r>
+    </w:p>
+    <w:p>
+      <w:pPr>
+        <w:shd w:fill="F4F5FB" w:val="clear"/>
+        <w:spacing w:after="160" w:before="40" w:line="264"/>
+        <w:ind w:left="120" w:right="120"/>
+      </w:pPr>
+      <w:r>
+        <w:rPr>
+          <w:rFonts w:ascii="Consolas" w:cs="Consolas" w:eastAsia="Consolas" w:hAnsi="Consolas"/>
+          <w:color w:val="1B1E48"/>
+          <w:sz w:val="19"/>
+          <w:szCs w:val="19"/>
+        </w:rPr>
+        <w:t xml:space="preserve">.\branch</w:t>
+      </w:r>
+    </w:p>
+    <w:p>
+      <w:pPr>
+        <w:spacing w:after="60" w:before="80"/>
+      </w:pPr>
+      <w:r>
+        <w:rPr>
+          <w:rFonts w:ascii="Calibri" w:cs="Calibri" w:eastAsia="Calibri" w:hAnsi="Calibri"/>
+          <w:b/>
+          <w:bCs/>
+          <w:color w:val="1A1A2E"/>
+          <w:sz w:val="22"/>
+          <w:szCs w:val="22"/>
+        </w:rPr>
+        <w:t xml:space="preserve">Manual way (and for colleagues):</w:t>
+      </w:r>
+    </w:p>
+    <w:p>
+      <w:pPr>
+        <w:shd w:fill="F4F5FB" w:val="clear"/>
+        <w:spacing w:after="0" w:before="40" w:line="264"/>
+        <w:ind w:left="120" w:right="120"/>
+      </w:pPr>
+      <w:r>
+        <w:rPr>
+          <w:rFonts w:ascii="Consolas" w:cs="Consolas" w:eastAsia="Consolas" w:hAnsi="Consolas"/>
+          <w:color w:val="1B1E48"/>
+          <w:sz w:val="19"/>
+          <w:szCs w:val="19"/>
+        </w:rPr>
+        <w:t xml:space="preserve">git checkout main</w:t>
+      </w:r>
+    </w:p>
+    <w:p>
+      <w:pPr>
+        <w:shd w:fill="F4F5FB" w:val="clear"/>
+        <w:spacing w:after="0" w:before="0" w:line="264"/>
+        <w:ind w:left="120" w:right="120"/>
+      </w:pPr>
+      <w:r>
+        <w:rPr>
+          <w:rFonts w:ascii="Consolas" w:cs="Consolas" w:eastAsia="Consolas" w:hAnsi="Consolas"/>
+          <w:color w:val="1B1E48"/>
+          <w:sz w:val="19"/>
+          <w:szCs w:val="19"/>
+        </w:rPr>
+        <w:t xml:space="preserve">git pull                          # get everyone's latest</w:t>
+      </w:r>
+    </w:p>
+    <w:p>
+      <w:pPr>
+        <w:shd w:fill="F4F5FB" w:val="clear"/>
+        <w:spacing w:after="160" w:before="0" w:line="264"/>
+        <w:ind w:left="120" w:right="120"/>
+      </w:pPr>
+      <w:r>
+        <w:rPr>
+          <w:rFonts w:ascii="Consolas" w:cs="Consolas" w:eastAsia="Consolas" w:hAnsi="Consolas"/>
+          <w:color w:val="1B1E48"/>
+          <w:sz w:val="19"/>
+          <w:szCs w:val="19"/>
+        </w:rPr>
+        <w:t xml:space="preserve">git checkout -b feat/my-widget    # -b = create + switch to a new branch</w:t>
+      </w:r>
+    </w:p>
+    <w:p>
+      <w:pPr>
+        <w:pStyle w:val="Heading1"/>
+        <w:spacing w:after="140" w:before="320"/>
+      </w:pPr>
+      <w:r>
+        <w:rPr>
+          <w:rFonts w:ascii="Calibri" w:cs="Calibri" w:eastAsia="Calibri" w:hAnsi="Calibri"/>
+          <w:b/>
+          <w:bCs/>
+          <w:color w:val="2850E7"/>
+          <w:sz w:val="30"/>
+          <w:szCs w:val="30"/>
+        </w:rPr>
+        <w:t xml:space="preserve">3.  Build / edit on localhost</w:t>
+      </w:r>
+    </w:p>
+    <w:p>
+      <w:pPr>
+        <w:spacing w:after="120" w:line="276"/>
+      </w:pPr>
+      <w:r>
+        <w:rPr>
+          <w:rFonts w:ascii="Calibri" w:cs="Calibri" w:eastAsia="Calibri" w:hAnsi="Calibri"/>
+          <w:color w:val="1A1A2E"/>
+          <w:sz w:val="22"/>
+          <w:szCs w:val="22"/>
+        </w:rPr>
+        <w:t xml:space="preserve">Make your change — by hand in the editor, or by asking Cursor / Claude (for example: “Build the straddle chart widget from Figma node 46:5014”). The house rules load automatically, so the brand styling is handled for you.</w:t>
+      </w:r>
+    </w:p>
+    <w:p>
+      <w:pPr>
+        <w:spacing w:after="120" w:line="276"/>
+      </w:pPr>
+      <w:r>
+        <w:rPr>
+          <w:rFonts w:ascii="Calibri" w:cs="Calibri" w:eastAsia="Calibri" w:hAnsi="Calibri"/>
+          <w:b/>
+          <w:bCs/>
+          <w:color w:val="1A1A2E"/>
+          <w:sz w:val="22"/>
+          <w:szCs w:val="22"/>
+        </w:rPr>
+        <w:t xml:space="preserve">As you save, http://localhost:3000 refreshes instantly</w:t>
+      </w:r>
+      <w:r>
+        <w:rPr>
+          <w:rFonts w:ascii="Calibri" w:cs="Calibri" w:eastAsia="Calibri" w:hAnsi="Calibri"/>
+          <w:color w:val="1A1A2E"/>
+          <w:sz w:val="22"/>
+          <w:szCs w:val="22"/>
+        </w:rPr>
+        <w:t xml:space="preserve"> and shows your change. This is private to your laptop until you push. Iterate until you are happy.</w:t>
+      </w:r>
+    </w:p>
+    <w:p>
+      <w:pPr>
+        <w:pStyle w:val="Heading1"/>
+        <w:spacing w:after="140" w:before="320"/>
+      </w:pPr>
+      <w:r>
+        <w:rPr>
+          <w:rFonts w:ascii="Calibri" w:cs="Calibri" w:eastAsia="Calibri" w:hAnsi="Calibri"/>
+          <w:b/>
+          <w:bCs/>
+          <w:color w:val="2850E7"/>
+          <w:sz w:val="30"/>
+          <w:szCs w:val="30"/>
+        </w:rPr>
+        <w:t xml:space="preserve">4.  Save &amp; go live</w:t>
       </w:r>
     </w:p>
     <w:p>
@@ -1484,7 +1170,212 @@
           <w:sz w:val="25"/>
           <w:szCs w:val="25"/>
         </w:rPr>
-        <w:t xml:space="preserve">How it works</w:t>
+        <w:t xml:space="preserve">The easy way (owner): the “ship” command</w:t>
+      </w:r>
+    </w:p>
+    <w:p>
+      <w:pPr>
+        <w:spacing w:after="120" w:line="276"/>
+      </w:pPr>
+      <w:r>
+        <w:rPr>
+          <w:rFonts w:ascii="Calibri" w:cs="Calibri" w:eastAsia="Calibri" w:hAnsi="Calibri"/>
+          <w:color w:val="1A1A2E"/>
+          <w:sz w:val="22"/>
+          <w:szCs w:val="22"/>
+        </w:rPr>
+        <w:t xml:space="preserve">When you are happy with localhost, open PowerShell in the project folder and run:</w:t>
+      </w:r>
+    </w:p>
+    <w:p>
+      <w:pPr>
+        <w:shd w:fill="F4F5FB" w:val="clear"/>
+        <w:spacing w:after="0" w:before="40" w:line="264"/>
+        <w:ind w:left="120" w:right="120"/>
+      </w:pPr>
+      <w:r>
+        <w:rPr>
+          <w:rFonts w:ascii="Consolas" w:cs="Consolas" w:eastAsia="Consolas" w:hAnsi="Consolas"/>
+          <w:color w:val="1B1E48"/>
+          <w:sz w:val="19"/>
+          <w:szCs w:val="19"/>
+        </w:rPr>
+        <w:t xml:space="preserve">cd C:\Users\Admin\Downloads\Terminal-Project</w:t>
+      </w:r>
+    </w:p>
+    <w:p>
+      <w:pPr>
+        <w:shd w:fill="F4F5FB" w:val="clear"/>
+        <w:spacing w:after="160" w:before="0" w:line="264"/>
+        <w:ind w:left="120" w:right="120"/>
+      </w:pPr>
+      <w:r>
+        <w:rPr>
+          <w:rFonts w:ascii="Consolas" w:cs="Consolas" w:eastAsia="Consolas" w:hAnsi="Consolas"/>
+          <w:color w:val="1B1E48"/>
+          <w:sz w:val="19"/>
+          <w:szCs w:val="19"/>
+        </w:rPr>
+        <w:t xml:space="preserve">.\ship</w:t>
+      </w:r>
+    </w:p>
+    <w:p>
+      <w:pPr>
+        <w:spacing w:after="120" w:line="276"/>
+      </w:pPr>
+      <w:r>
+        <w:rPr>
+          <w:rFonts w:ascii="Calibri" w:cs="Calibri" w:eastAsia="Calibri" w:hAnsi="Calibri"/>
+          <w:color w:val="1A1A2E"/>
+          <w:sz w:val="22"/>
+          <w:szCs w:val="22"/>
+        </w:rPr>
+        <w:t xml:space="preserve">It asks “What did you change?”, then does everything — stages your changes, commits, merges into main, and pushes. Your change is live in about a minute. One word replaces all the git commands below.</w:t>
+      </w:r>
+    </w:p>
+    <w:p>
+      <w:pPr>
+        <w:pStyle w:val="Heading2"/>
+        <w:spacing w:after="100" w:before="220"/>
+      </w:pPr>
+      <w:r>
+        <w:rPr>
+          <w:rFonts w:ascii="Calibri" w:cs="Calibri" w:eastAsia="Calibri" w:hAnsi="Calibri"/>
+          <w:b/>
+          <w:bCs/>
+          <w:color w:val="1A1A2E"/>
+          <w:sz w:val="25"/>
+          <w:szCs w:val="25"/>
+        </w:rPr>
+        <w:t xml:space="preserve">The manual way (and what every colleague should do)</w:t>
+      </w:r>
+    </w:p>
+    <w:p>
+      <w:pPr>
+        <w:spacing w:after="120" w:line="276"/>
+      </w:pPr>
+      <w:r>
+        <w:rPr>
+          <w:rFonts w:ascii="Calibri" w:cs="Calibri" w:eastAsia="Calibri" w:hAnsi="Calibri"/>
+          <w:color w:val="1A1A2E"/>
+          <w:sz w:val="22"/>
+          <w:szCs w:val="22"/>
+        </w:rPr>
+        <w:t xml:space="preserve">When the change looks right:</w:t>
+      </w:r>
+    </w:p>
+    <w:p>
+      <w:pPr>
+        <w:shd w:fill="F4F5FB" w:val="clear"/>
+        <w:spacing w:after="0" w:before="40" w:line="264"/>
+        <w:ind w:left="120" w:right="120"/>
+      </w:pPr>
+      <w:r>
+        <w:rPr>
+          <w:rFonts w:ascii="Consolas" w:cs="Consolas" w:eastAsia="Consolas" w:hAnsi="Consolas"/>
+          <w:color w:val="1B1E48"/>
+          <w:sz w:val="19"/>
+          <w:szCs w:val="19"/>
+        </w:rPr>
+        <w:t xml:space="preserve">git add -A                        # -A = gather ALL your changed files</w:t>
+      </w:r>
+    </w:p>
+    <w:p>
+      <w:pPr>
+        <w:shd w:fill="F4F5FB" w:val="clear"/>
+        <w:spacing w:after="0" w:before="0" w:line="264"/>
+        <w:ind w:left="120" w:right="120"/>
+      </w:pPr>
+      <w:r>
+        <w:rPr>
+          <w:rFonts w:ascii="Consolas" w:cs="Consolas" w:eastAsia="Consolas" w:hAnsi="Consolas"/>
+          <w:color w:val="1B1E48"/>
+          <w:sz w:val="19"/>
+          <w:szCs w:val="19"/>
+        </w:rPr>
+        <w:t xml:space="preserve">git commit -m "Describe what you did"</w:t>
+      </w:r>
+    </w:p>
+    <w:p>
+      <w:pPr>
+        <w:shd w:fill="F4F5FB" w:val="clear"/>
+        <w:spacing w:after="160" w:before="0" w:line="264"/>
+        <w:ind w:left="120" w:right="120"/>
+      </w:pPr>
+      <w:r>
+        <w:rPr>
+          <w:rFonts w:ascii="Consolas" w:cs="Consolas" w:eastAsia="Consolas" w:hAnsi="Consolas"/>
+          <w:color w:val="1B1E48"/>
+          <w:sz w:val="19"/>
+          <w:szCs w:val="19"/>
+        </w:rPr>
+        <w:t xml:space="preserve">git push -u origin feat/my-widget # upload your branch to GitHub</w:t>
+      </w:r>
+    </w:p>
+    <w:p>
+      <w:pPr>
+        <w:spacing w:after="120" w:line="276"/>
+      </w:pPr>
+      <w:r>
+        <w:rPr>
+          <w:rFonts w:ascii="Calibri" w:cs="Calibri" w:eastAsia="Calibri" w:hAnsi="Calibri"/>
+          <w:b/>
+          <w:bCs/>
+          <w:color w:val="C0392B"/>
+          <w:sz w:val="22"/>
+          <w:szCs w:val="22"/>
+        </w:rPr>
+        <w:t xml:space="preserve">IMPORTANT — pushing your branch does NOT update the live site.</w:t>
+      </w:r>
+      <w:r>
+        <w:rPr>
+          <w:rFonts w:ascii="Calibri" w:cs="Calibri" w:eastAsia="Calibri" w:hAnsi="Calibri"/>
+          <w:color w:val="1A1A2E"/>
+          <w:sz w:val="22"/>
+          <w:szCs w:val="22"/>
+        </w:rPr>
+        <w:t xml:space="preserve"> A branch push only creates a private preview. Your change goes live ONLY after it is merged into main (below). If the site did not change, this is why.</w:t>
+      </w:r>
+    </w:p>
+    <w:p>
+      <w:pPr>
+        <w:spacing w:after="60" w:before="100"/>
+      </w:pPr>
+      <w:r>
+        <w:rPr>
+          <w:rFonts w:ascii="Calibri" w:cs="Calibri" w:eastAsia="Calibri" w:hAnsi="Calibri"/>
+          <w:b/>
+          <w:bCs/>
+          <w:color w:val="1A1A2E"/>
+          <w:sz w:val="22"/>
+          <w:szCs w:val="22"/>
+        </w:rPr>
+        <w:t xml:space="preserve">To make it live, merge into main — two ways:</w:t>
+      </w:r>
+    </w:p>
+    <w:p>
+      <w:pPr>
+        <w:spacing w:after="120" w:line="276"/>
+      </w:pPr>
+      <w:r>
+        <w:rPr>
+          <w:rFonts w:ascii="Calibri" w:cs="Calibri" w:eastAsia="Calibri" w:hAnsi="Calibri"/>
+          <w:b/>
+          <w:bCs/>
+          <w:color w:val="1A1A2E"/>
+          <w:sz w:val="22"/>
+          <w:szCs w:val="22"/>
+        </w:rPr>
+        <w:t xml:space="preserve">Option A — Pull Request (recommended for the team).</w:t>
+      </w:r>
+      <w:r>
+        <w:rPr>
+          <w:rFonts w:ascii="Calibri" w:cs="Calibri" w:eastAsia="Calibri" w:hAnsi="Calibri"/>
+          <w:color w:val="1A1A2E"/>
+          <w:sz w:val="22"/>
+          <w:szCs w:val="22"/>
+        </w:rPr>
+        <w:t xml:space="preserve"> In the browser on the repository page:</w:t>
       </w:r>
     </w:p>
     <w:p>
@@ -1503,7 +1394,47 @@
           <w:sz w:val="22"/>
           <w:szCs w:val="22"/>
         </w:rPr>
-        <w:t xml:space="preserve">In Next.js, a folder under app/preview/&lt;name&gt;/ with a page.tsx file becomes a public URL.</w:t>
+        <w:t xml:space="preserve">Click </w:t>
+      </w:r>
+      <w:r>
+        <w:rPr>
+          <w:rFonts w:ascii="Calibri" w:cs="Calibri" w:eastAsia="Calibri" w:hAnsi="Calibri"/>
+          <w:b/>
+          <w:bCs/>
+          <w:color w:val="1A1A2E"/>
+          <w:sz w:val="22"/>
+          <w:szCs w:val="22"/>
+        </w:rPr>
+        <w:t xml:space="preserve">Compare &amp; pull request</w:t>
+      </w:r>
+      <w:r>
+        <w:rPr>
+          <w:rFonts w:ascii="Calibri" w:cs="Calibri" w:eastAsia="Calibri" w:hAnsi="Calibri"/>
+          <w:color w:val="1A1A2E"/>
+          <w:sz w:val="22"/>
+          <w:szCs w:val="22"/>
+        </w:rPr>
+        <w:t xml:space="preserve">, then </w:t>
+      </w:r>
+      <w:r>
+        <w:rPr>
+          <w:rFonts w:ascii="Calibri" w:cs="Calibri" w:eastAsia="Calibri" w:hAnsi="Calibri"/>
+          <w:b/>
+          <w:bCs/>
+          <w:color w:val="1A1A2E"/>
+          <w:sz w:val="22"/>
+          <w:szCs w:val="22"/>
+        </w:rPr>
+        <w:t xml:space="preserve">Create pull request</w:t>
+      </w:r>
+      <w:r>
+        <w:rPr>
+          <w:rFonts w:ascii="Calibri" w:cs="Calibri" w:eastAsia="Calibri" w:hAnsi="Calibri"/>
+          <w:color w:val="1A1A2E"/>
+          <w:sz w:val="22"/>
+          <w:szCs w:val="22"/>
+        </w:rPr>
+        <w:t xml:space="preserve">.</w:t>
       </w:r>
     </w:p>
     <w:p>
@@ -1522,7 +1453,202 @@
           <w:sz w:val="22"/>
           <w:szCs w:val="22"/>
         </w:rPr>
-        <w:t xml:space="preserve">That page renders only your element — nothing else (no topbar, no other widgets).</w:t>
+        <w:t xml:space="preserve">Review, then click </w:t>
+      </w:r>
+      <w:r>
+        <w:rPr>
+          <w:rFonts w:ascii="Calibri" w:cs="Calibri" w:eastAsia="Calibri" w:hAnsi="Calibri"/>
+          <w:b/>
+          <w:bCs/>
+          <w:color w:val="1A1A2E"/>
+          <w:sz w:val="22"/>
+          <w:szCs w:val="22"/>
+        </w:rPr>
+        <w:t xml:space="preserve">Merge pull request</w:t>
+      </w:r>
+      <w:r>
+        <w:rPr>
+          <w:rFonts w:ascii="Calibri" w:cs="Calibri" w:eastAsia="Calibri" w:hAnsi="Calibri"/>
+          <w:color w:val="1A1A2E"/>
+          <w:sz w:val="22"/>
+          <w:szCs w:val="22"/>
+        </w:rPr>
+        <w:t xml:space="preserve"> — this auto-deploys to live.</w:t>
+      </w:r>
+    </w:p>
+    <w:p>
+      <w:pPr>
+        <w:spacing w:after="60" w:before="100"/>
+      </w:pPr>
+      <w:r>
+        <w:rPr>
+          <w:rFonts w:ascii="Calibri" w:cs="Calibri" w:eastAsia="Calibri" w:hAnsi="Calibri"/>
+          <w:b/>
+          <w:bCs/>
+          <w:color w:val="1A1A2E"/>
+          <w:sz w:val="22"/>
+          <w:szCs w:val="22"/>
+        </w:rPr>
+        <w:t xml:space="preserve">Option B — Quick merge from the terminal (fine for the owner working solo):</w:t>
+      </w:r>
+    </w:p>
+    <w:p>
+      <w:pPr>
+        <w:shd w:fill="F4F5FB" w:val="clear"/>
+        <w:spacing w:after="0" w:before="40" w:line="264"/>
+        <w:ind w:left="120" w:right="120"/>
+      </w:pPr>
+      <w:r>
+        <w:rPr>
+          <w:rFonts w:ascii="Consolas" w:cs="Consolas" w:eastAsia="Consolas" w:hAnsi="Consolas"/>
+          <w:color w:val="1B1E48"/>
+          <w:sz w:val="19"/>
+          <w:szCs w:val="19"/>
+        </w:rPr>
+        <w:t xml:space="preserve">git checkout main</w:t>
+      </w:r>
+    </w:p>
+    <w:p>
+      <w:pPr>
+        <w:shd w:fill="F4F5FB" w:val="clear"/>
+        <w:spacing w:after="0" w:before="0" w:line="264"/>
+        <w:ind w:left="120" w:right="120"/>
+      </w:pPr>
+      <w:r>
+        <w:rPr>
+          <w:rFonts w:ascii="Consolas" w:cs="Consolas" w:eastAsia="Consolas" w:hAnsi="Consolas"/>
+          <w:color w:val="1B1E48"/>
+          <w:sz w:val="19"/>
+          <w:szCs w:val="19"/>
+        </w:rPr>
+        <w:t xml:space="preserve">git pull</w:t>
+      </w:r>
+    </w:p>
+    <w:p>
+      <w:pPr>
+        <w:shd w:fill="F4F5FB" w:val="clear"/>
+        <w:spacing w:after="0" w:before="0" w:line="264"/>
+        <w:ind w:left="120" w:right="120"/>
+      </w:pPr>
+      <w:r>
+        <w:rPr>
+          <w:rFonts w:ascii="Consolas" w:cs="Consolas" w:eastAsia="Consolas" w:hAnsi="Consolas"/>
+          <w:color w:val="1B1E48"/>
+          <w:sz w:val="19"/>
+          <w:szCs w:val="19"/>
+        </w:rPr>
+        <w:t xml:space="preserve">git merge feat/my-widget       # bring your branch into main</w:t>
+      </w:r>
+    </w:p>
+    <w:p>
+      <w:pPr>
+        <w:shd w:fill="F4F5FB" w:val="clear"/>
+        <w:spacing w:after="160" w:before="0" w:line="264"/>
+        <w:ind w:left="120" w:right="120"/>
+      </w:pPr>
+      <w:r>
+        <w:rPr>
+          <w:rFonts w:ascii="Consolas" w:cs="Consolas" w:eastAsia="Consolas" w:hAnsi="Consolas"/>
+          <w:color w:val="1B1E48"/>
+          <w:sz w:val="19"/>
+          <w:szCs w:val="19"/>
+        </w:rPr>
+        <w:t xml:space="preserve">git push origin main           # -&gt; auto-deploys to the live site</w:t>
+      </w:r>
+    </w:p>
+    <w:p>
+      <w:pPr>
+        <w:spacing w:after="120" w:line="276"/>
+      </w:pPr>
+      <w:r>
+        <w:rPr>
+          <w:rFonts w:ascii="Calibri" w:cs="Calibri" w:eastAsia="Calibri" w:hAnsi="Calibri"/>
+          <w:b/>
+          <w:bCs/>
+          <w:color w:val="1A1A2E"/>
+          <w:sz w:val="22"/>
+          <w:szCs w:val="22"/>
+        </w:rPr>
+        <w:t xml:space="preserve">Tip: </w:t>
+      </w:r>
+      <w:r>
+        <w:rPr>
+          <w:rFonts w:ascii="Calibri" w:cs="Calibri" w:eastAsia="Calibri" w:hAnsi="Calibri"/>
+          <w:i/>
+          <w:iCs/>
+          <w:color w:val="68697E"/>
+          <w:sz w:val="22"/>
+          <w:szCs w:val="22"/>
+        </w:rPr>
+        <w:t xml:space="preserve">after it is live, wait about a minute then hard-refresh with Ctrl + Shift + R to clear the browser cache.</w:t>
+      </w:r>
+    </w:p>
+    <w:p>
+      <w:pPr>
+        <w:pStyle w:val="Heading1"/>
+        <w:spacing w:after="140" w:before="320"/>
+      </w:pPr>
+      <w:r>
+        <w:rPr>
+          <w:rFonts w:ascii="Calibri" w:cs="Calibri" w:eastAsia="Calibri" w:hAnsi="Calibri"/>
+          <w:b/>
+          <w:bCs/>
+          <w:color w:val="2850E7"/>
+          <w:sz w:val="30"/>
+          <w:szCs w:val="30"/>
+        </w:rPr>
+        <w:t xml:space="preserve">5.  Take a widget's design INTO Figma (code → Figma)</w:t>
+      </w:r>
+    </w:p>
+    <w:p>
+      <w:pPr>
+        <w:spacing w:after="120" w:line="276"/>
+      </w:pPr>
+      <w:r>
+        <w:rPr>
+          <w:rFonts w:ascii="Calibri" w:cs="Calibri" w:eastAsia="Calibri" w:hAnsi="Calibri"/>
+          <w:color w:val="1A1A2E"/>
+          <w:sz w:val="22"/>
+          <w:szCs w:val="22"/>
+        </w:rPr>
+        <w:t xml:space="preserve">When you want a widget or element to exist in Figma — and only that element — use a </w:t>
+      </w:r>
+      <w:r>
+        <w:rPr>
+          <w:rFonts w:ascii="Calibri" w:cs="Calibri" w:eastAsia="Calibri" w:hAnsi="Calibri"/>
+          <w:b/>
+          <w:bCs/>
+          <w:color w:val="1A1A2E"/>
+          <w:sz w:val="22"/>
+          <w:szCs w:val="22"/>
+        </w:rPr>
+        <w:t xml:space="preserve">preview route</w:t>
+      </w:r>
+      <w:r>
+        <w:rPr>
+          <w:rFonts w:ascii="Calibri" w:cs="Calibri" w:eastAsia="Calibri" w:hAnsi="Calibri"/>
+          <w:color w:val="1A1A2E"/>
+          <w:sz w:val="22"/>
+          <w:szCs w:val="22"/>
+        </w:rPr>
+        <w:t xml:space="preserve">. It is a tiny page that shows one element alone, giving it its own public URL.</w:t>
+      </w:r>
+    </w:p>
+    <w:p>
+      <w:pPr>
+        <w:pStyle w:val="Heading2"/>
+        <w:spacing w:after="100" w:before="220"/>
+      </w:pPr>
+      <w:r>
+        <w:rPr>
+          <w:rFonts w:ascii="Calibri" w:cs="Calibri" w:eastAsia="Calibri" w:hAnsi="Calibri"/>
+          <w:b/>
+          <w:bCs/>
+          <w:color w:val="1A1A2E"/>
+          <w:sz w:val="25"/>
+          <w:szCs w:val="25"/>
+        </w:rPr>
+        <w:t xml:space="preserve">How it works</w:t>
       </w:r>
     </w:p>
     <w:p>
@@ -1530,7 +1656,45 @@
         <w:pStyle w:val="ListParagraph"/>
         <w:numPr>
           <w:ilvl w:val="0"/>
-          <w:numId w:val="3"/>
+          <w:numId w:val="2"/>
+        </w:numPr>
+        <w:spacing w:after="80" w:line="276"/>
+      </w:pPr>
+      <w:r>
+        <w:rPr>
+          <w:rFonts w:ascii="Calibri" w:cs="Calibri" w:eastAsia="Calibri" w:hAnsi="Calibri"/>
+          <w:color w:val="1A1A2E"/>
+          <w:sz w:val="22"/>
+          <w:szCs w:val="22"/>
+        </w:rPr>
+        <w:t xml:space="preserve">In Next.js, a folder under app/preview/&lt;name&gt;/ with a page.tsx file becomes a public URL.</w:t>
+      </w:r>
+    </w:p>
+    <w:p>
+      <w:pPr>
+        <w:pStyle w:val="ListParagraph"/>
+        <w:numPr>
+          <w:ilvl w:val="0"/>
+          <w:numId w:val="2"/>
+        </w:numPr>
+        <w:spacing w:after="80" w:line="276"/>
+      </w:pPr>
+      <w:r>
+        <w:rPr>
+          <w:rFonts w:ascii="Calibri" w:cs="Calibri" w:eastAsia="Calibri" w:hAnsi="Calibri"/>
+          <w:color w:val="1A1A2E"/>
+          <w:sz w:val="22"/>
+          <w:szCs w:val="22"/>
+        </w:rPr>
+        <w:t xml:space="preserve">That page renders only your element — nothing else (no topbar, no other widgets).</w:t>
+      </w:r>
+    </w:p>
+    <w:p>
+      <w:pPr>
+        <w:pStyle w:val="ListParagraph"/>
+        <w:numPr>
+          <w:ilvl w:val="0"/>
+          <w:numId w:val="2"/>
         </w:numPr>
         <w:spacing w:after="80" w:line="276"/>
       </w:pPr>
@@ -1923,7 +2087,7 @@
         <w:pStyle w:val="ListParagraph"/>
         <w:numPr>
           <w:ilvl w:val="0"/>
-          <w:numId w:val="3"/>
+          <w:numId w:val="2"/>
         </w:numPr>
         <w:spacing w:after="80" w:line="276"/>
       </w:pPr>
@@ -1942,7 +2106,7 @@
         <w:pStyle w:val="ListParagraph"/>
         <w:numPr>
           <w:ilvl w:val="0"/>
-          <w:numId w:val="3"/>
+          <w:numId w:val="2"/>
         </w:numPr>
         <w:spacing w:after="80" w:line="276"/>
       </w:pPr>
@@ -1961,7 +2125,7 @@
         <w:pStyle w:val="ListParagraph"/>
         <w:numPr>
           <w:ilvl w:val="0"/>
-          <w:numId w:val="3"/>
+          <w:numId w:val="2"/>
         </w:numPr>
         <w:spacing w:after="80" w:line="276"/>
       </w:pPr>
@@ -1980,7 +2144,7 @@
         <w:pStyle w:val="ListParagraph"/>
         <w:numPr>
           <w:ilvl w:val="0"/>
-          <w:numId w:val="3"/>
+          <w:numId w:val="2"/>
         </w:numPr>
         <w:spacing w:after="80" w:line="276"/>
       </w:pPr>
@@ -2303,13 +2467,13 @@
     </w:lvlOverride>
   </w:num>
   <w:num w:numId="2">
-    <w:abstractNumId w:val="4"/>
+    <w:abstractNumId w:val="2"/>
     <w:lvlOverride w:ilvl="0">
       <w:startOverride w:val="1"/>
     </w:lvlOverride>
   </w:num>
   <w:num w:numId="3">
-    <w:abstractNumId w:val="2"/>
+    <w:abstractNumId w:val="4"/>
     <w:lvlOverride w:ilvl="0">
       <w:startOverride w:val="1"/>
     </w:lvlOverride>

</xml_diff>